<commit_message>
update document for getCLIDMapping
</commit_message>
<xml_diff>
--- a/SCFIND Core Methods_no_annotation_names.docx
+++ b/SCFIND Core Methods_no_annotation_names.docx
@@ -2217,29 +2217,7 @@
             <w:szCs w:val="22"/>
             <w14:ligatures w14:val="none"/>
           </w:rPr>
-          <w:t>https://scfind.hubmapconsortium.org/api/l</w:t>
-        </w:r>
-        <w:r>
-          <w:rPr>
-            <w:rFonts w:ascii="Arial" w:eastAsia="Times New Roman" w:hAnsi="Arial" w:cs="Arial"/>
-            <w:color w:val="000000"/>
-            <w:kern w:val="0"/>
-            <w:sz w:val="22"/>
-            <w:szCs w:val="22"/>
-            <w14:ligatures w14:val="none"/>
-          </w:rPr>
-          <w:t>i</w:t>
-        </w:r>
-        <w:r>
-          <w:rPr>
-            <w:rFonts w:ascii="Arial" w:eastAsia="Times New Roman" w:hAnsi="Arial" w:cs="Arial"/>
-            <w:color w:val="000000"/>
-            <w:kern w:val="0"/>
-            <w:sz w:val="22"/>
-            <w:szCs w:val="22"/>
-            <w14:ligatures w14:val="none"/>
-          </w:rPr>
-          <w:t>stIndexVersions</w:t>
+          <w:t>https://scfind.hubmapconsortium.org/api/listIndexVersions</w:t>
         </w:r>
       </w:hyperlink>
       <w:r>
@@ -2609,19 +2587,7 @@
           <w:rPr>
             <w:rStyle w:val="Hyperlink"/>
           </w:rPr>
-          <w:t>https://scfind.hubmapconso</w:t>
-        </w:r>
-        <w:r>
-          <w:rPr>
-            <w:rStyle w:val="Hyperlink"/>
-          </w:rPr>
-          <w:t>r</w:t>
-        </w:r>
-        <w:r>
-          <w:rPr>
-            <w:rStyle w:val="Hyperlink"/>
-          </w:rPr>
-          <w:t>tium.org/api/cellTypeNames</w:t>
+          <w:t>https://scfind.hubmapconsortium.org/api/cellTypeNames</w:t>
         </w:r>
       </w:hyperlink>
       <w:r>
@@ -12130,29 +12096,7 @@
             <w:szCs w:val="22"/>
             <w14:ligatures w14:val="none"/>
           </w:rPr>
-          <w:t>https://scfind.hubmapconsortium.org/api/getDat</w:t>
-        </w:r>
-        <w:r>
-          <w:rPr>
-            <w:rStyle w:val="Hyperlink"/>
-            <w:rFonts w:ascii="Arial" w:eastAsia="Times New Roman" w:hAnsi="Arial" w:cs="Arial"/>
-            <w:kern w:val="0"/>
-            <w:sz w:val="22"/>
-            <w:szCs w:val="22"/>
-            <w14:ligatures w14:val="none"/>
-          </w:rPr>
-          <w:t>a</w:t>
-        </w:r>
-        <w:r>
-          <w:rPr>
-            <w:rStyle w:val="Hyperlink"/>
-            <w:rFonts w:ascii="Arial" w:eastAsia="Times New Roman" w:hAnsi="Arial" w:cs="Arial"/>
-            <w:kern w:val="0"/>
-            <w:sz w:val="22"/>
-            <w:szCs w:val="22"/>
-            <w14:ligatures w14:val="none"/>
-          </w:rPr>
-          <w:t>sets</w:t>
+          <w:t>https://scfind.hubmapconsortium.org/api/getDatasets</w:t>
         </w:r>
       </w:hyperlink>
     </w:p>
@@ -15062,7 +15006,29 @@
             <w:szCs w:val="22"/>
             <w14:ligatures w14:val="none"/>
           </w:rPr>
-          <w:t>https://scfind.hubmapconsortium.org/api/total_cells</w:t>
+          <w:t>https://scfind.hubmapconsortium.org/api/tot</w:t>
+        </w:r>
+        <w:r>
+          <w:rPr>
+            <w:rStyle w:val="Hyperlink"/>
+            <w:rFonts w:ascii="Arial" w:eastAsia="Times New Roman" w:hAnsi="Arial" w:cs="Arial"/>
+            <w:kern w:val="0"/>
+            <w:sz w:val="22"/>
+            <w:szCs w:val="22"/>
+            <w14:ligatures w14:val="none"/>
+          </w:rPr>
+          <w:t>a</w:t>
+        </w:r>
+        <w:r>
+          <w:rPr>
+            <w:rStyle w:val="Hyperlink"/>
+            <w:rFonts w:ascii="Arial" w:eastAsia="Times New Roman" w:hAnsi="Arial" w:cs="Arial"/>
+            <w:kern w:val="0"/>
+            <w:sz w:val="22"/>
+            <w:szCs w:val="22"/>
+            <w14:ligatures w14:val="none"/>
+          </w:rPr>
+          <w:t>l_cells</w:t>
         </w:r>
       </w:hyperlink>
     </w:p>
@@ -15208,6 +15174,19 @@
         </w:rPr>
         <w:t>Number of total cells.</w:t>
       </w:r>
+    </w:p>
+    <w:p>
+      <w:pPr>
+        <w:spacing w:after="0" w:line="240" w:lineRule="auto"/>
+        <w:rPr>
+          <w:rFonts w:ascii="Arial" w:eastAsia="Times New Roman" w:hAnsi="Arial" w:cs="Arial"/>
+          <w:color w:val="000000"/>
+          <w:kern w:val="0"/>
+          <w:sz w:val="22"/>
+          <w:szCs w:val="22"/>
+          <w14:ligatures w14:val="none"/>
+        </w:rPr>
+      </w:pPr>
     </w:p>
     <w:p>
       <w:pPr>
@@ -15392,7 +15371,31 @@
             <w:sz w:val="26"/>
             <w:szCs w:val="26"/>
           </w:rPr>
-          <w:t>https://scfind.hubmapconsortium.org/api/total_cell_types</w:t>
+          <w:t>https://scfind.hubmapconsortium</w:t>
+        </w:r>
+        <w:r>
+          <w:rPr>
+            <w:rFonts w:ascii="AppleSystemUIFont" w:hAnsi="AppleSystemUIFont" w:cs="AppleSystemUIFont"/>
+            <w:b/>
+            <w:bCs/>
+            <w:color w:val="DCA10D"/>
+            <w:kern w:val="0"/>
+            <w:sz w:val="26"/>
+            <w:szCs w:val="26"/>
+          </w:rPr>
+          <w:t>.</w:t>
+        </w:r>
+        <w:r>
+          <w:rPr>
+            <w:rFonts w:ascii="AppleSystemUIFont" w:hAnsi="AppleSystemUIFont" w:cs="AppleSystemUIFont"/>
+            <w:b/>
+            <w:bCs/>
+            <w:color w:val="DCA10D"/>
+            <w:kern w:val="0"/>
+            <w:sz w:val="26"/>
+            <w:szCs w:val="26"/>
+          </w:rPr>
+          <w:t>org/api/total_cell_types</w:t>
         </w:r>
       </w:hyperlink>
     </w:p>
@@ -15519,6 +15522,243 @@
       <w:pPr>
         <w:spacing w:after="0" w:line="240" w:lineRule="auto"/>
         <w:rPr>
+          <w:rFonts w:ascii="AppleSystemUIFont" w:hAnsi="AppleSystemUIFont"/>
+          <w:kern w:val="0"/>
+        </w:rPr>
+      </w:pPr>
+    </w:p>
+    <w:p>
+      <w:pPr>
+        <w:spacing w:after="0" w:line="240" w:lineRule="auto"/>
+        <w:rPr>
+          <w:rFonts w:ascii="Arial" w:eastAsia="Times New Roman" w:hAnsi="Arial" w:cs="Arial"/>
+          <w:color w:val="000000"/>
+          <w:kern w:val="36"/>
+          <w:sz w:val="40"/>
+          <w:szCs w:val="40"/>
+          <w14:ligatures w14:val="none"/>
+        </w:rPr>
+      </w:pPr>
+      <w:proofErr w:type="spellStart"/>
+      <w:r>
+        <w:rPr>
+          <w:rFonts w:ascii="Arial" w:eastAsia="Times New Roman" w:hAnsi="Arial" w:cs="Arial"/>
+          <w:color w:val="000000"/>
+          <w:kern w:val="36"/>
+          <w:sz w:val="40"/>
+          <w:szCs w:val="40"/>
+          <w14:ligatures w14:val="none"/>
+        </w:rPr>
+        <w:t>getCLIDmappingAll</w:t>
+      </w:r>
+      <w:proofErr w:type="spellEnd"/>
+    </w:p>
+    <w:p>
+      <w:pPr>
+        <w:spacing w:after="0" w:line="240" w:lineRule="auto"/>
+        <w:rPr>
+          <w:rFonts w:ascii="Arial" w:eastAsia="Times New Roman" w:hAnsi="Arial" w:cs="Arial"/>
+          <w:color w:val="000000"/>
+          <w:kern w:val="0"/>
+          <w:sz w:val="22"/>
+          <w:szCs w:val="22"/>
+          <w14:ligatures w14:val="none"/>
+        </w:rPr>
+      </w:pPr>
+      <w:r>
+        <w:rPr>
+          <w:rFonts w:ascii="Arial" w:eastAsia="Times New Roman" w:hAnsi="Arial" w:cs="Arial"/>
+          <w:color w:val="000000"/>
+          <w:kern w:val="0"/>
+          <w:sz w:val="22"/>
+          <w:szCs w:val="22"/>
+          <w14:ligatures w14:val="none"/>
+        </w:rPr>
+        <w:t>Get mapping between CLIP label and cell type annotations.</w:t>
+      </w:r>
+    </w:p>
+    <w:p>
+      <w:pPr>
+        <w:spacing w:after="0" w:line="240" w:lineRule="auto"/>
+        <w:rPr>
+          <w:rFonts w:ascii="AppleSystemUIFont" w:hAnsi="AppleSystemUIFont"/>
+          <w:kern w:val="0"/>
+        </w:rPr>
+      </w:pPr>
+    </w:p>
+    <w:p>
+      <w:pPr>
+        <w:spacing w:after="0" w:line="240" w:lineRule="auto"/>
+        <w:rPr>
+          <w:rFonts w:ascii="Arial" w:eastAsia="Times New Roman" w:hAnsi="Arial" w:cs="Arial"/>
+          <w:b/>
+          <w:bCs/>
+          <w:color w:val="000000"/>
+          <w:kern w:val="0"/>
+          <w:sz w:val="22"/>
+          <w:szCs w:val="22"/>
+          <w14:ligatures w14:val="none"/>
+        </w:rPr>
+      </w:pPr>
+      <w:r>
+        <w:rPr>
+          <w:rFonts w:ascii="Arial" w:eastAsia="Times New Roman" w:hAnsi="Arial" w:cs="Arial"/>
+          <w:b/>
+          <w:bCs/>
+          <w:color w:val="000000"/>
+          <w:kern w:val="0"/>
+          <w:sz w:val="22"/>
+          <w:szCs w:val="22"/>
+          <w14:ligatures w14:val="none"/>
+        </w:rPr>
+        <w:t>API:</w:t>
+      </w:r>
+    </w:p>
+    <w:p>
+      <w:pPr>
+        <w:shd w:val="clear" w:color="auto" w:fill="000000"/>
+        <w:spacing w:after="0" w:line="240" w:lineRule="auto"/>
+        <w:rPr>
+          <w:rFonts w:ascii="Roboto Mono" w:eastAsia="Times New Roman" w:hAnsi="Roboto Mono" w:cs="Times New Roman"/>
+          <w:color w:val="DCDCAA"/>
+          <w:kern w:val="0"/>
+          <w:sz w:val="22"/>
+          <w:szCs w:val="22"/>
+          <w14:ligatures w14:val="none"/>
+        </w:rPr>
+      </w:pPr>
+      <w:r>
+        <w:rPr>
+          <w:rFonts w:ascii="Roboto Mono" w:eastAsia="Times New Roman" w:hAnsi="Roboto Mono" w:cs="Times New Roman"/>
+          <w:color w:val="DCDCAA"/>
+          <w:kern w:val="0"/>
+          <w:sz w:val="22"/>
+          <w:szCs w:val="22"/>
+          <w14:ligatures w14:val="none"/>
+        </w:rPr>
+        <w:t>@app.route('/api/clidMappingAll', methods=['GET', 'POST'])</w:t>
+      </w:r>
+    </w:p>
+    <w:p>
+      <w:pPr>
+        <w:spacing w:after="0" w:line="240" w:lineRule="auto"/>
+        <w:rPr>
+          <w:rFonts w:ascii="Arial" w:eastAsia="Times New Roman" w:hAnsi="Arial" w:cs="Arial"/>
+          <w:b/>
+          <w:bCs/>
+          <w:color w:val="000000"/>
+          <w:kern w:val="0"/>
+          <w:sz w:val="22"/>
+          <w:szCs w:val="22"/>
+          <w14:ligatures w14:val="none"/>
+        </w:rPr>
+      </w:pPr>
+      <w:r>
+        <w:rPr>
+          <w:rFonts w:ascii="Arial" w:eastAsia="Times New Roman" w:hAnsi="Arial" w:cs="Arial"/>
+          <w:b/>
+          <w:bCs/>
+          <w:color w:val="000000"/>
+          <w:kern w:val="0"/>
+          <w:sz w:val="22"/>
+          <w:szCs w:val="22"/>
+          <w14:ligatures w14:val="none"/>
+        </w:rPr>
+        <w:t xml:space="preserve">Example: </w:t>
+      </w:r>
+      <w:hyperlink r:id="rId37" w:history="1">
+        <w:r>
+          <w:rPr>
+            <w:rFonts w:ascii="AppleSystemUIFont" w:hAnsi="AppleSystemUIFont" w:cs="AppleSystemUIFont"/>
+            <w:b/>
+            <w:bCs/>
+            <w:color w:val="DCA10D"/>
+            <w:kern w:val="0"/>
+            <w:sz w:val="26"/>
+            <w:szCs w:val="26"/>
+          </w:rPr>
+          <w:t>https://scfind.hubmapconsortium.org/ap</w:t>
+        </w:r>
+        <w:r>
+          <w:rPr>
+            <w:rFonts w:ascii="AppleSystemUIFont" w:hAnsi="AppleSystemUIFont" w:cs="AppleSystemUIFont"/>
+            <w:b/>
+            <w:bCs/>
+            <w:color w:val="DCA10D"/>
+            <w:kern w:val="0"/>
+            <w:sz w:val="26"/>
+            <w:szCs w:val="26"/>
+          </w:rPr>
+          <w:t>i</w:t>
+        </w:r>
+        <w:r>
+          <w:rPr>
+            <w:rFonts w:ascii="AppleSystemUIFont" w:hAnsi="AppleSystemUIFont" w:cs="AppleSystemUIFont"/>
+            <w:b/>
+            <w:bCs/>
+            <w:color w:val="DCA10D"/>
+            <w:kern w:val="0"/>
+            <w:sz w:val="26"/>
+            <w:szCs w:val="26"/>
+          </w:rPr>
+          <w:t>/clidM</w:t>
+        </w:r>
+        <w:r>
+          <w:rPr>
+            <w:rFonts w:ascii="AppleSystemUIFont" w:hAnsi="AppleSystemUIFont" w:cs="AppleSystemUIFont"/>
+            <w:b/>
+            <w:bCs/>
+            <w:color w:val="DCA10D"/>
+            <w:kern w:val="0"/>
+            <w:sz w:val="26"/>
+            <w:szCs w:val="26"/>
+          </w:rPr>
+          <w:t>a</w:t>
+        </w:r>
+        <w:r>
+          <w:rPr>
+            <w:rFonts w:ascii="AppleSystemUIFont" w:hAnsi="AppleSystemUIFont" w:cs="AppleSystemUIFont"/>
+            <w:b/>
+            <w:bCs/>
+            <w:color w:val="DCA10D"/>
+            <w:kern w:val="0"/>
+            <w:sz w:val="26"/>
+            <w:szCs w:val="26"/>
+          </w:rPr>
+          <w:t>ppingAll</w:t>
+        </w:r>
+      </w:hyperlink>
+      <w:r>
+        <w:rPr>
+          <w:rFonts w:ascii="Arial" w:eastAsia="Times New Roman" w:hAnsi="Arial" w:cs="Arial"/>
+          <w:b/>
+          <w:bCs/>
+          <w:color w:val="000000"/>
+          <w:kern w:val="0"/>
+          <w:sz w:val="22"/>
+          <w:szCs w:val="22"/>
+          <w14:ligatures w14:val="none"/>
+        </w:rPr>
+        <w:t xml:space="preserve"> </w:t>
+      </w:r>
+      <w:r>
+        <w:rPr>
+          <w:rFonts w:ascii="Arial" w:eastAsia="Times New Roman" w:hAnsi="Arial" w:cs="Arial"/>
+          <w:b/>
+          <w:bCs/>
+          <w:color w:val="000000"/>
+          <w:kern w:val="0"/>
+          <w:sz w:val="22"/>
+          <w:szCs w:val="22"/>
+          <w14:ligatures w14:val="none"/>
+        </w:rPr>
+        <w:t xml:space="preserve"> </w:t>
+      </w:r>
+    </w:p>
+    <w:p>
+      <w:pPr>
+        <w:spacing w:after="0" w:line="240" w:lineRule="auto"/>
+        <w:rPr>
           <w:rFonts w:ascii="Arial" w:eastAsia="Times New Roman" w:hAnsi="Arial" w:cs="Arial"/>
           <w:color w:val="000000"/>
           <w:kern w:val="0"/>
@@ -15552,6 +15792,7 @@
           <w:szCs w:val="40"/>
           <w14:ligatures w14:val="none"/>
         </w:rPr>
+        <w:lastRenderedPageBreak/>
         <w:t>Notes</w:t>
       </w:r>
     </w:p>

</xml_diff>